<commit_message>
docs: dashboards connectors 9 (+Rav-Messer +ActiveTrail) in doc + xlsx
</commit_message>
<xml_diff>
--- a/PRODUCTS/02-HELIX-dashboards.docx
+++ b/PRODUCTS/02-HELIX-dashboards.docx
@@ -183,7 +183,29 @@
           <w:rtl w:val="1"/>
           <w:rFonts w:cs="Arial"/>
         </w:rPr>
-        <w:t xml:space="preserve"> (wedge) → נמכר לסוכנויות (white-label). תאריך עודכן: 2026-07-20 · סטטוס: אפיון (</w:t>
+        <w:t xml:space="preserve"> (wedge) → </w:t>
+      </w:r>
+      <w:r>
+        <w:rPr>
+          <w:rFonts w:ascii="Arial" w:hAnsi="Arial"/>
+          <w:b/>
+          <w:i/>
+          <w:sz w:val="22"/>
+          <w:rtl w:val="1"/>
+          <w:rFonts w:cs="Arial"/>
+        </w:rPr>
+        <w:t>מודל דואלי:</w:t>
+      </w:r>
+      <w:r>
+        <w:rPr>
+          <w:rFonts w:ascii="Arial" w:hAnsi="Arial"/>
+          <w:b w:val="0"/>
+          <w:i/>
+          <w:sz w:val="22"/>
+          <w:rtl w:val="1"/>
+          <w:rFonts w:cs="Arial"/>
+        </w:rPr>
+        <w:t xml:space="preserve"> מכירה ישירה תחת מותג HELIX (ערוץ ראשי) + הפצה white-label דרך שותף/סוכנות (ערוץ אופציונלי). תאריך עודכן: 2026-07-20 · סטטוס: אפיון (</w:t>
       </w:r>
       <w:r>
         <w:rPr>
@@ -6115,7 +6137,7 @@
           <w:rtl w:val="1"/>
           <w:rFonts w:cs="Arial"/>
         </w:rPr>
-        <w:t>סוכנות: בתשלום</w:t>
+        <w:t>ישיר (ערוץ ראשי):</w:t>
       </w:r>
       <w:r>
         <w:rPr>
@@ -6125,7 +6147,7 @@
           <w:rtl w:val="1"/>
           <w:rFonts w:cs="Arial"/>
         </w:rPr>
-        <w:t xml:space="preserve"> — white-label (מיתוג שלהם), ריבוי לקוחות, benchmark, ניהול. תמחור per-לקוח או flat.</w:t>
+        <w:t xml:space="preserve"> עסקים משדרגים לתשלום ישירות מולנו תחת מותג HELIX — יותר מקורות/דוחות, הסרת מיתוג, פיצ'רים מתקדמים.</w:t>
       </w:r>
     </w:p>
     <w:p>
@@ -6142,7 +6164,7 @@
           <w:rtl w:val="1"/>
           <w:rFonts w:cs="Arial"/>
         </w:rPr>
-        <w:t>הכלי לא צריך להרוויח בעצמו</w:t>
+        <w:t>הפצה/שת"פ (ערוץ אופציונלי):</w:t>
       </w:r>
       <w:r>
         <w:rPr>
@@ -6152,7 +6174,34 @@
           <w:rtl w:val="1"/>
           <w:rFonts w:cs="Arial"/>
         </w:rPr>
-        <w:t xml:space="preserve"> — הוא מזין את המשפך של HELIX.</w:t>
+        <w:t xml:space="preserve"> סוכנות בתשלום — white-label (מיתוג שלהם), ריבוי לקוחות, benchmark, ניהול. תמחור per-לקוח או flat.</w:t>
+      </w:r>
+    </w:p>
+    <w:p>
+      <w:pPr>
+        <w:pStyle w:val="ListBullet"/>
+        <w:bidi w:val="1"/>
+        <w:jc w:val="right"/>
+      </w:pPr>
+      <w:r>
+        <w:rPr>
+          <w:rFonts w:ascii="Arial" w:hAnsi="Arial"/>
+          <w:b/>
+          <w:sz w:val="22"/>
+          <w:rtl w:val="1"/>
+          <w:rFonts w:cs="Arial"/>
+        </w:rPr>
+        <w:t>הכלי לא חייב להרוויח בעצמו</w:t>
+      </w:r>
+      <w:r>
+        <w:rPr>
+          <w:rFonts w:ascii="Arial" w:hAnsi="Arial"/>
+          <w:b w:val="0"/>
+          <w:sz w:val="22"/>
+          <w:rtl w:val="1"/>
+          <w:rFonts w:cs="Arial"/>
+        </w:rPr>
+        <w:t xml:space="preserve"> — גם מזין את המשפך של HELIX.</w:t>
       </w:r>
     </w:p>
     <w:p>
@@ -8050,17 +8099,17 @@
                 <w:rtl w:val="1"/>
                 <w:rFonts w:cs="Arial"/>
               </w:rPr>
-              <w:t>Connectors (חיים, 6)</w:t>
-            </w:r>
-            <w:r>
-              <w:rPr>
-                <w:rFonts w:ascii="Arial" w:hAnsi="Arial"/>
-                <w:b w:val="0"/>
-                <w:sz w:val="20"/>
-                <w:rtl w:val="1"/>
-                <w:rFonts w:cs="Arial"/>
-              </w:rPr>
-              <w:t xml:space="preserve"> — GA4 (OAuth) · Meta Ads · Stripe · Shopify · </w:t>
+              <w:t>Connectors (חיים, 9)</w:t>
+            </w:r>
+            <w:r>
+              <w:rPr>
+                <w:rFonts w:ascii="Arial" w:hAnsi="Arial"/>
+                <w:b w:val="0"/>
+                <w:sz w:val="20"/>
+                <w:rtl w:val="1"/>
+                <w:rFonts w:cs="Arial"/>
+              </w:rPr>
+              <w:t xml:space="preserve"> — GA4 (OAuth) · Meta Ads · Stripe · Shopify · Plausible · Mailchimp · </w:t>
             </w:r>
             <w:r>
               <w:rPr>
@@ -8070,17 +8119,57 @@
                 <w:rtl w:val="1"/>
                 <w:rFonts w:cs="Arial"/>
               </w:rPr>
-              <w:t>Plausible · Mailchimp</w:t>
-            </w:r>
-            <w:r>
-              <w:rPr>
-                <w:rFonts w:ascii="Arial" w:hAnsi="Arial"/>
-                <w:b w:val="0"/>
-                <w:sz w:val="20"/>
-                <w:rtl w:val="1"/>
-                <w:rFonts w:cs="Arial"/>
-              </w:rPr>
-              <w:t xml:space="preserve"> → </w:t>
+              <w:t>HELIX OPS (A/B)</w:t>
+            </w:r>
+            <w:r>
+              <w:rPr>
+                <w:rFonts w:ascii="Arial" w:hAnsi="Arial"/>
+                <w:b w:val="0"/>
+                <w:sz w:val="20"/>
+                <w:rtl w:val="1"/>
+                <w:rFonts w:cs="Arial"/>
+              </w:rPr>
+              <w:t xml:space="preserve"> · </w:t>
+            </w:r>
+            <w:r>
+              <w:rPr>
+                <w:rFonts w:ascii="Arial" w:hAnsi="Arial"/>
+                <w:b/>
+                <w:sz w:val="20"/>
+                <w:rtl w:val="1"/>
+                <w:rFonts w:cs="Arial"/>
+              </w:rPr>
+              <w:t>רב-מסר/Responder</w:t>
+            </w:r>
+            <w:r>
+              <w:rPr>
+                <w:rFonts w:ascii="Arial" w:hAnsi="Arial"/>
+                <w:b w:val="0"/>
+                <w:sz w:val="20"/>
+                <w:rtl w:val="1"/>
+                <w:rFonts w:cs="Arial"/>
+              </w:rPr>
+              <w:t xml:space="preserve"> 🇮🇱 · </w:t>
+            </w:r>
+            <w:r>
+              <w:rPr>
+                <w:rFonts w:ascii="Arial" w:hAnsi="Arial"/>
+                <w:b/>
+                <w:sz w:val="20"/>
+                <w:rtl w:val="1"/>
+                <w:rFonts w:cs="Arial"/>
+              </w:rPr>
+              <w:t>ActiveTrail</w:t>
+            </w:r>
+            <w:r>
+              <w:rPr>
+                <w:rFonts w:ascii="Arial" w:hAnsi="Arial"/>
+                <w:b w:val="0"/>
+                <w:sz w:val="20"/>
+                <w:rtl w:val="1"/>
+                <w:rFonts w:cs="Arial"/>
+              </w:rPr>
+              <w:t xml:space="preserve"> 🇮🇱 → </w:t>
             </w:r>
             <w:r>
               <w:rPr>
@@ -8113,7 +8202,7 @@
                 <w:rtl w:val="1"/>
                 <w:rFonts w:cs="Consolas"/>
               </w:rPr>
-              <w:t>lib/connectors/{ga4,meta,stripe,shopify,plausible,mailchimp,registry}</w:t>
+              <w:t>lib/connectors/{ga4,meta,stripe,shopify,plausible,mailchimp,helixops,ravmesser,activetrail,registry}</w:t>
             </w:r>
             <w:r>
               <w:rPr>

</xml_diff>

<commit_message>
docs: add InforU connector (doc + xlsx)
</commit_message>
<xml_diff>
--- a/PRODUCTS/02-HELIX-dashboards.docx
+++ b/PRODUCTS/02-HELIX-dashboards.docx
@@ -8099,7 +8099,7 @@
                 <w:rtl w:val="1"/>
                 <w:rFonts w:cs="Arial"/>
               </w:rPr>
-              <w:t>Connectors (חיים, 9)</w:t>
+              <w:t>Connectors (חיים, 10)</w:t>
             </w:r>
             <w:r>
               <w:rPr>
@@ -8169,6 +8169,26 @@
                 <w:rtl w:val="1"/>
                 <w:rFonts w:cs="Arial"/>
               </w:rPr>
+              <w:t xml:space="preserve"> 🇮🇱 · </w:t>
+            </w:r>
+            <w:r>
+              <w:rPr>
+                <w:rFonts w:ascii="Arial" w:hAnsi="Arial"/>
+                <w:b/>
+                <w:sz w:val="20"/>
+                <w:rtl w:val="1"/>
+                <w:rFonts w:cs="Arial"/>
+              </w:rPr>
+              <w:t>InforU</w:t>
+            </w:r>
+            <w:r>
+              <w:rPr>
+                <w:rFonts w:ascii="Arial" w:hAnsi="Arial"/>
+                <w:b w:val="0"/>
+                <w:sz w:val="20"/>
+                <w:rtl w:val="1"/>
+                <w:rFonts w:cs="Arial"/>
+              </w:rPr>
               <w:t xml:space="preserve"> 🇮🇱 → </w:t>
             </w:r>
             <w:r>
@@ -8202,7 +8222,7 @@
                 <w:rtl w:val="1"/>
                 <w:rFonts w:cs="Consolas"/>
               </w:rPr>
-              <w:t>lib/connectors/{ga4,meta,stripe,shopify,plausible,mailchimp,helixops,ravmesser,activetrail,registry}</w:t>
+              <w:t>lib/connectors/{ga4,meta,stripe,shopify,plausible,mailchimp,helixops,ravmesser,activetrail,inforu,registry}</w:t>
             </w:r>
             <w:r>
               <w:rPr>

</xml_diff>

<commit_message>
content(dashboards): surface editorial chart figures in digest
Update the Dashboards product page + spec doc to reflect the new
nyyon-figures integration: every digest now carries a branded HELIX chart
image (not just text). Adds a subService card, enriches the digest narrative
and delivery FAQ, and documents built/remaining in section 12.2 of the Word spec.

Co-Authored-By: Claude Opus 4.8 (1M context) <noreply@anthropic.com>
</commit_message>
<xml_diff>
--- a/PRODUCTS/02-HELIX-dashboards.docx
+++ b/PRODUCTS/02-HELIX-dashboards.docx
@@ -9973,6 +9973,198 @@
           <w:rFonts w:cs="Arial"/>
         </w:rPr>
         <w:t>.</w:t>
+      </w:r>
+    </w:p>
+    <w:p>
+      <w:pPr>
+        <w:pStyle w:val="Heading3"/>
+        <w:jc w:val="right"/>
+        <w:bidi/>
+      </w:pPr>
+      <w:r>
+        <w:rPr>
+          <w:rtl w:val="1"/>
+        </w:rPr>
+        <w:t>12.2 גרפים עריכתיים ב-Digest (nyyon-figures) — נוסף 04.08.2026 🖼️</w:t>
+      </w:r>
+    </w:p>
+    <w:p>
+      <w:pPr>
+        <w:jc w:val="right"/>
+        <w:bidi/>
+      </w:pPr>
+      <w:r>
+        <w:rPr>
+          <w:rtl w:val="1"/>
+        </w:rPr>
+        <w:t>שולבה ספריית nyyon-figures (MIT, רצה מקומית) שמייצרת גרפים עריכתיים כ-SVG טהור → PNG דרך resvg-wasm — בלי מודל תמונה ובלי רשת. מעתה כל דייג'סט נושא גם גרף ממותג HELIX, לא רק טקסט. כללי המלאכה (עמודות מתחילות מאפס, סקאלות משותפות, בועות לפי שטח) אכופים בתוך ה-renderer.</w:t>
+      </w:r>
+    </w:p>
+    <w:p>
+      <w:pPr>
+        <w:jc w:val="right"/>
+        <w:bidi/>
+      </w:pPr>
+      <w:r>
+        <w:rPr>
+          <w:rtl w:val="1"/>
+        </w:rPr>
+        <w:t>✅ נבנה (end-to-end, נדחף ל-main → Vercel):</w:t>
+      </w:r>
+    </w:p>
+    <w:p>
+      <w:pPr>
+        <w:pStyle w:val="ListBullet"/>
+        <w:jc w:val="right"/>
+        <w:bidi/>
+      </w:pPr>
+      <w:r>
+        <w:rPr>
+          <w:rtl w:val="1"/>
+        </w:rPr>
+        <w:t>Renderer מוטמע תחת lib/nyyon/ (settings/charts/templates/animate/render.js + assets/fonts + index_bg.wasm); עטיפה HELIX (accent אמרלד #10B981) ב-lib/nyyon/index.ts.</w:t>
+      </w:r>
+    </w:p>
+    <w:p>
+      <w:pPr>
+        <w:pStyle w:val="ListBullet"/>
+        <w:jc w:val="right"/>
+        <w:bidi/>
+      </w:pPr>
+      <w:r>
+        <w:rPr>
+          <w:rtl w:val="1"/>
+        </w:rPr>
+        <w:t>תיקון עברית: הוספת Rubik.ttf כ-fallback ל-FONT_FILES → עברית מתרנדרת RTL נכון. בלעדיו IBM Plex מציג ריבועים (tofu).</w:t>
+      </w:r>
+    </w:p>
+    <w:p>
+      <w:pPr>
+        <w:pStyle w:val="ListBullet"/>
+        <w:jc w:val="right"/>
+        <w:bidi/>
+      </w:pPr>
+      <w:r>
+        <w:rPr>
+          <w:rtl w:val="1"/>
+        </w:rPr>
+        <w:t>מיפוי widgets → גרף אחד (lib/digest-figure.ts): series→קו/עמודות, funnel→משפך, KPIs→עמודות. מחזיר null כשאין מספיק דאטה — לא ממציא גרף.</w:t>
+      </w:r>
+    </w:p>
+    <w:p>
+      <w:pPr>
+        <w:pStyle w:val="ListBullet"/>
+        <w:jc w:val="right"/>
+        <w:bidi/>
+      </w:pPr>
+      <w:r>
+        <w:rPr>
+          <w:rtl w:val="1"/>
+        </w:rPr>
+        <w:t>העלאת PNG ל-bucket ציבורי digest-figures ← URL (lib/digest-storage.ts).</w:t>
+      </w:r>
+    </w:p>
+    <w:p>
+      <w:pPr>
+        <w:pStyle w:val="ListBullet"/>
+        <w:jc w:val="right"/>
+        <w:bidi/>
+      </w:pPr>
+      <w:r>
+        <w:rPr>
+          <w:rtl w:val="1"/>
+        </w:rPr>
+        <w:t>מסירה רב-ערוצית: lib/channels.ts קיבל שולחי תמונה (טלגרם sendPhoto, וואטסאפ image, מייל inline). deliver() מקבל imageUrl אופציונלי. digest-data.ts: workspaceDigestRich() מחזיר {text, figure}. חובר ל-/api/digest ול-/api/cron/digest.</w:t>
+      </w:r>
+    </w:p>
+    <w:p>
+      <w:pPr>
+        <w:pStyle w:val="ListBullet"/>
+        <w:jc w:val="right"/>
+        <w:bidi/>
+      </w:pPr>
+      <w:r>
+        <w:rPr>
+          <w:rtl w:val="1"/>
+        </w:rPr>
+        <w:t>תשתית: התלות @resvg/resvg-wasm ב-serverExternalPackages; הפונטים+wasm נכנסים ל-bundle של Vercel דרך outputFileTracingIncludes. typecheck + next build עוברים.</w:t>
+      </w:r>
+    </w:p>
+    <w:p>
+      <w:pPr>
+        <w:jc w:val="right"/>
+        <w:bidi/>
+      </w:pPr>
+      <w:r>
+        <w:rPr>
+          <w:rtl w:val="1"/>
+        </w:rPr>
+        <w:t>⬜ נשאר להשלים:</w:t>
+      </w:r>
+    </w:p>
+    <w:p>
+      <w:pPr>
+        <w:pStyle w:val="ListBullet"/>
+        <w:jc w:val="right"/>
+        <w:bidi/>
+      </w:pPr>
+      <w:r>
+        <w:rPr>
+          <w:rtl w:val="1"/>
+        </w:rPr>
+        <w:t>לוודא שה-bucket digest-figures קיים כ-public (createBucket idempotent רץ אוטומטית; אם ה-service-role חסום ליצירת buckets — ליצור ידנית).</w:t>
+      </w:r>
+    </w:p>
+    <w:p>
+      <w:pPr>
+        <w:pStyle w:val="ListBullet"/>
+        <w:jc w:val="right"/>
+        <w:bidi/>
+      </w:pPr>
+      <w:r>
+        <w:rPr>
+          <w:rtl w:val="1"/>
+        </w:rPr>
+        <w:t>לחבר גם ל-bot טלגרם (app/api/telegram/route.ts) כך שבקשת digest בצ'אט תחזיר גם את הגרף.</w:t>
+      </w:r>
+    </w:p>
+    <w:p>
+      <w:pPr>
+        <w:pStyle w:val="ListBullet"/>
+        <w:jc w:val="right"/>
+        <w:bidi/>
+      </w:pPr>
+      <w:r>
+        <w:rPr>
+          <w:rtl w:val="1"/>
+        </w:rPr>
+        <w:t>כריכת דוח 1200×630 (renderCoverPng כבר מוכן) לשיתוף / OG-image.</w:t>
+      </w:r>
+    </w:p>
+    <w:p>
+      <w:pPr>
+        <w:pStyle w:val="ListBullet"/>
+        <w:jc w:val="right"/>
+        <w:bidi/>
+      </w:pPr>
+      <w:r>
+        <w:rPr>
+          <w:rtl w:val="1"/>
+        </w:rPr>
+        <w:t>כיווניות RTL מלאה של הגרפים עצמם — כיום הטקסט העברי נכון אך העמודות גדלות LTR.</w:t>
+      </w:r>
+    </w:p>
+    <w:p>
+      <w:pPr>
+        <w:pStyle w:val="ListBullet"/>
+        <w:jc w:val="right"/>
+        <w:bidi/>
+      </w:pPr>
+      <w:r>
+        <w:rPr>
+          <w:rtl w:val="1"/>
+        </w:rPr>
+        <w:t>אופציונלי: בחירת סוג גרף / ריבוי גרפים per-דוח, ו-caching של ה-PNG לפי חתימת נתונים.</w:t>
       </w:r>
     </w:p>
     <w:p>

</xml_diff>

<commit_message>
docs(autonomy): Phase 4 cross-product dispatch — spec + hub page + specs + xlsx env
Co-Authored-By: Claude Opus 4.8 (1M context) <noreply@anthropic.com>
</commit_message>
<xml_diff>
--- a/PRODUCTS/02-HELIX-dashboards.docx
+++ b/PRODUCTS/02-HELIX-dashboards.docx
@@ -19531,6 +19531,24 @@
     <w:p>
       <w:r>
         <w:t>הדייג'סט מסמן יזום KPIs שמידרדרים (delta ≤ -10% מול התקופה הקודמת) — Von rule 3, 'X מידרדר' — במקום רק לרשום מספרים. slippingKpis (דטרמיניסטי; ה-LLM רק מנסח). בנוסף הותקנה תשתית המתג (lib/autonomy/*, supabase/autonomy.sql) לקראת הפיכת Dashboards ל-context-graph hub מרכזי שמנתב פעולות חוצות-מוצר (dash.cross_act) בשלב הבא. metric_points כבר משמש single-source שכל המוצרים מזרימים אליו.</w:t>
+      </w:r>
+    </w:p>
+    <w:p>
+      <w:r>
+        <w:t>---</w:t>
+      </w:r>
+    </w:p>
+    <w:p>
+      <w:pPr>
+        <w:pStyle w:val="Heading2"/>
+      </w:pPr>
+      <w:r>
+        <w:t>Phase 4 — dispatch חוצה-מוצר מה-hub (2026-08-10)</w:t>
+      </w:r>
+    </w:p>
+    <w:p>
+      <w:r>
+        <w:t>הדייג'סט cron מזהה KPIs מידרדרים לכל workspace, וכש-dash.cross_act ב-approve/autopilot הוא שולח לטריגר של המוצר האחראי (Growth Doctor POST /api/act/trigger) דרך lib/autonomy/dispatch.ts — env-driven (GROWTH_DOCTOR_URL+CROSS_ACT_SECRET), fail-safe (no-op אם לא מוגדר). המוצר-היעד מפעיל מחדש את המתג שלו, כך שה-hub רק מבקש — לא כופה. ברירת מחדל advisor=אין dispatch.</w:t>
       </w:r>
     </w:p>
     <w:sectPr>

</xml_diff>